<commit_message>
lab 2 redone rep + counters
</commit_message>
<xml_diff>
--- a/lab2/lab2_отчет.docx
+++ b/lab2/lab2_отчет.docx
@@ -4,7 +4,7 @@
   <w:body>
     <w:p>
       <w:pPr>
-        <w:spacing w:line="278" w:lineRule="auto"/>
+        <w:spacing w:line="278" w:lineRule="auto" w:after="0"/>
         <w:jc w:val="center"/>
         <w:rPr>
           <w:lang w:val="ru-RU"/>
@@ -22,7 +22,7 @@
     </w:p>
     <w:p>
       <w:pPr>
-        <w:spacing w:after="160" w:line="278" w:lineRule="auto"/>
+        <w:spacing w:after="0" w:line="278" w:lineRule="auto"/>
         <w:jc w:val="center"/>
         <w:rPr>
           <w:lang w:val="ru-RU"/>
@@ -40,7 +40,7 @@
     <w:p>
       <w:pPr>
         <w:keepNext/>
-        <w:spacing w:before="180" w:after="80" w:line="278" w:lineRule="auto"/>
+        <w:spacing w:before="180" w:after="0" w:line="278" w:lineRule="auto"/>
         <w:jc w:val="both"/>
         <w:rPr>
           <w:lang w:val="ru-RU"/>
@@ -58,7 +58,7 @@
     </w:p>
     <w:p>
       <w:pPr>
-        <w:spacing w:after="80" w:line="278" w:lineRule="auto"/>
+        <w:spacing w:after="0" w:line="278" w:lineRule="auto"/>
         <w:ind w:firstLine="312"/>
         <w:jc w:val="both"/>
         <w:rPr>
@@ -67,25 +67,16 @@
       </w:pPr>
       <w:r>
         <w:rPr>
-          <w:rFonts w:eastAsia="Times New Roman" w:ascii="Times New Roman" w:hAnsi="Times New Roman"/>
+          <w:rFonts w:ascii="Times New Roman" w:hAnsi="Times New Roman" w:eastAsia="Times New Roman"/>
           <w:sz w:val="26"/>
-          <w:lang w:val="ru-RU"/>
         </w:rPr>
-        <w:t xml:space="preserve">Закрепить знания о форматах хранения растровых изображений и способах получения информации из графических </w:t>
-      </w:r>
-      <w:r>
-        <w:rPr>
-          <w:rFonts w:eastAsia="Times New Roman" w:ascii="Times New Roman" w:hAnsi="Times New Roman"/>
-          <w:sz w:val="26"/>
-          <w:lang w:val="ru-RU"/>
-        </w:rPr>
-        <w:t>файлов. Разработать приложение, которое вручную считывает характеристики изображений из двоичных файлов.</w:t>
+        <w:t>Выполнение настоящей работы имеет целью закрепление теоретического материала и практическое освоение основных возможностей по работе с различными форматами хранения растровых изображений и получению информации об изображении, хранящемся в файле.</w:t>
       </w:r>
     </w:p>
     <w:p>
       <w:pPr>
         <w:keepNext/>
-        <w:spacing w:before="180" w:after="80" w:line="278" w:lineRule="auto"/>
+        <w:spacing w:before="180" w:after="0" w:line="278" w:lineRule="auto"/>
         <w:jc w:val="both"/>
         <w:rPr>
           <w:lang w:val="ru-RU"/>
@@ -108,7 +99,7 @@
           <w:ilvl w:val="0"/>
           <w:numId w:val="10"/>
         </w:numPr>
-        <w:spacing w:after="40" w:line="278" w:lineRule="auto"/>
+        <w:spacing w:after="0" w:line="278" w:lineRule="auto"/>
         <w:jc w:val="both"/>
         <w:rPr>
           <w:lang w:val="ru-RU"/>
@@ -116,26 +107,10 @@
       </w:pPr>
       <w:r>
         <w:rPr>
-          <w:rFonts w:eastAsia="Times New Roman" w:ascii="Times New Roman" w:hAnsi="Times New Roman"/>
-          <w:sz w:val="26"/>
-          <w:lang w:val="ru-RU"/>
-        </w:rPr>
-        <w:t xml:space="preserve">Обеспечить выбор папки (до 100 000 файлов) и вывод имени, размеров в пикселях, </w:t>
-      </w:r>
-      <w:r>
-        <w:rPr>
-          <w:rFonts w:eastAsia="Times New Roman" w:ascii="Times New Roman" w:hAnsi="Times New Roman"/>
+          <w:rFonts w:ascii="Times New Roman" w:hAnsi="Times New Roman" w:eastAsia="Times New Roman"/>
           <w:sz w:val="26"/>
         </w:rPr>
-        <w:t>DPI</w:t>
-      </w:r>
-      <w:r>
-        <w:rPr>
-          <w:rFonts w:eastAsia="Times New Roman" w:ascii="Times New Roman" w:hAnsi="Times New Roman"/>
-          <w:sz w:val="26"/>
-          <w:lang w:val="ru-RU"/>
-        </w:rPr>
-        <w:t>, глубины цвета и сжатия.</w:t>
+        <w:t>Написать приложение, считывающее из графического файла или файлов выбранной папки (до 100 000 файлов) основную информацию: имя файла, размер изображения в пикселях, разрешение (dot/inch), глубину цвета и сжатие для тех типов файлов, в которых оно может быть задано.</w:t>
       </w:r>
     </w:p>
     <w:p>
@@ -145,7 +120,7 @@
           <w:ilvl w:val="0"/>
           <w:numId w:val="10"/>
         </w:numPr>
-        <w:spacing w:after="40" w:line="278" w:lineRule="auto"/>
+        <w:spacing w:after="0" w:line="278" w:lineRule="auto"/>
         <w:jc w:val="both"/>
         <w:rPr>
           <w:lang w:val="ru-RU"/>
@@ -153,108 +128,10 @@
       </w:pPr>
       <w:r>
         <w:rPr>
-          <w:rFonts w:eastAsia="Times New Roman" w:ascii="Times New Roman" w:hAnsi="Times New Roman"/>
-          <w:sz w:val="26"/>
-          <w:lang w:val="ru-RU"/>
-        </w:rPr>
-        <w:t xml:space="preserve">Поддержать </w:t>
-      </w:r>
-      <w:r>
-        <w:rPr>
-          <w:rFonts w:eastAsia="Times New Roman" w:ascii="Times New Roman" w:hAnsi="Times New Roman"/>
+          <w:rFonts w:ascii="Times New Roman" w:hAnsi="Times New Roman" w:eastAsia="Times New Roman"/>
           <w:sz w:val="26"/>
         </w:rPr>
-        <w:t>JPG</w:t>
-      </w:r>
-      <w:r>
-        <w:rPr>
-          <w:rFonts w:eastAsia="Times New Roman" w:ascii="Times New Roman" w:hAnsi="Times New Roman"/>
-          <w:sz w:val="26"/>
-          <w:lang w:val="ru-RU"/>
-        </w:rPr>
-        <w:t xml:space="preserve">, </w:t>
-      </w:r>
-      <w:r>
-        <w:rPr>
-          <w:rFonts w:eastAsia="Times New Roman" w:ascii="Times New Roman" w:hAnsi="Times New Roman"/>
-          <w:sz w:val="26"/>
-        </w:rPr>
-        <w:t>GIF</w:t>
-      </w:r>
-      <w:r>
-        <w:rPr>
-          <w:rFonts w:eastAsia="Times New Roman" w:ascii="Times New Roman" w:hAnsi="Times New Roman"/>
-          <w:sz w:val="26"/>
-          <w:lang w:val="ru-RU"/>
-        </w:rPr>
-        <w:t xml:space="preserve">, </w:t>
-      </w:r>
-      <w:r>
-        <w:rPr>
-          <w:rFonts w:eastAsia="Times New Roman" w:ascii="Times New Roman" w:hAnsi="Times New Roman"/>
-          <w:sz w:val="26"/>
-        </w:rPr>
-        <w:t>TI</w:t>
-      </w:r>
-      <w:r>
-        <w:rPr>
-          <w:rFonts w:eastAsia="Times New Roman" w:ascii="Times New Roman" w:hAnsi="Times New Roman"/>
-          <w:sz w:val="26"/>
-        </w:rPr>
-        <w:t>F</w:t>
-      </w:r>
-      <w:r>
-        <w:rPr>
-          <w:rFonts w:eastAsia="Times New Roman" w:ascii="Times New Roman" w:hAnsi="Times New Roman"/>
-          <w:sz w:val="26"/>
-          <w:lang w:val="ru-RU"/>
-        </w:rPr>
-        <w:t xml:space="preserve">, </w:t>
-      </w:r>
-      <w:r>
-        <w:rPr>
-          <w:rFonts w:eastAsia="Times New Roman" w:ascii="Times New Roman" w:hAnsi="Times New Roman"/>
-          <w:sz w:val="26"/>
-        </w:rPr>
-        <w:t>BMP</w:t>
-      </w:r>
-      <w:r>
-        <w:rPr>
-          <w:rFonts w:eastAsia="Times New Roman" w:ascii="Times New Roman" w:hAnsi="Times New Roman"/>
-          <w:sz w:val="26"/>
-          <w:lang w:val="ru-RU"/>
-        </w:rPr>
-        <w:t xml:space="preserve">, </w:t>
-      </w:r>
-      <w:r>
-        <w:rPr>
-          <w:rFonts w:eastAsia="Times New Roman" w:ascii="Times New Roman" w:hAnsi="Times New Roman"/>
-          <w:sz w:val="26"/>
-        </w:rPr>
-        <w:t>PNG</w:t>
-      </w:r>
-      <w:r>
-        <w:rPr>
-          <w:rFonts w:eastAsia="Times New Roman" w:ascii="Times New Roman" w:hAnsi="Times New Roman"/>
-          <w:sz w:val="26"/>
-          <w:lang w:val="ru-RU"/>
-        </w:rPr>
-        <w:t xml:space="preserve"> и </w:t>
-      </w:r>
-      <w:r>
-        <w:rPr>
-          <w:rFonts w:eastAsia="Times New Roman" w:ascii="Times New Roman" w:hAnsi="Times New Roman"/>
-          <w:sz w:val="26"/>
-        </w:rPr>
-        <w:t>PCX</w:t>
-      </w:r>
-      <w:r>
-        <w:rPr>
-          <w:rFonts w:eastAsia="Times New Roman" w:ascii="Times New Roman" w:hAnsi="Times New Roman"/>
-          <w:sz w:val="26"/>
-          <w:lang w:val="ru-RU"/>
-        </w:rPr>
-        <w:t xml:space="preserve"> без готовых библиотек получения метаданных.</w:t>
+        <w:t>Обрабатывать форматы JPG, GIF, TIF, BMP, PNG и PCX и обеспечивать корректность выводимых данных.</w:t>
       </w:r>
     </w:p>
     <w:p>
@@ -264,7 +141,7 @@
           <w:ilvl w:val="0"/>
           <w:numId w:val="10"/>
         </w:numPr>
-        <w:spacing w:after="40" w:line="278" w:lineRule="auto"/>
+        <w:spacing w:after="0" w:line="278" w:lineRule="auto"/>
         <w:jc w:val="both"/>
         <w:rPr>
           <w:lang w:val="ru-RU"/>
@@ -272,41 +149,10 @@
       </w:pPr>
       <w:r>
         <w:rPr>
-          <w:rFonts w:eastAsia="Times New Roman" w:ascii="Times New Roman" w:hAnsi="Times New Roman"/>
-          <w:sz w:val="26"/>
-          <w:lang w:val="ru-RU"/>
-        </w:rPr>
-        <w:t xml:space="preserve">Самостоятельно разбирать заголовки </w:t>
-      </w:r>
-      <w:r>
-        <w:rPr>
-          <w:rFonts w:eastAsia="Times New Roman" w:ascii="Times New Roman" w:hAnsi="Times New Roman"/>
+          <w:rFonts w:ascii="Times New Roman" w:hAnsi="Times New Roman" w:eastAsia="Times New Roman"/>
           <w:sz w:val="26"/>
         </w:rPr>
-        <w:t>BMP</w:t>
-      </w:r>
-      <w:r>
-        <w:rPr>
-          <w:rFonts w:eastAsia="Times New Roman" w:ascii="Times New Roman" w:hAnsi="Times New Roman"/>
-          <w:sz w:val="26"/>
-          <w:lang w:val="ru-RU"/>
-        </w:rPr>
-        <w:t xml:space="preserve">, чанки </w:t>
-      </w:r>
-      <w:r>
-        <w:rPr>
-          <w:rFonts w:eastAsia="Times New Roman" w:ascii="Times New Roman" w:hAnsi="Times New Roman"/>
-          <w:sz w:val="26"/>
-        </w:rPr>
-        <w:t>PNG</w:t>
-      </w:r>
-      <w:r>
-        <w:rPr>
-          <w:rFonts w:eastAsia="Times New Roman" w:ascii="Times New Roman" w:hAnsi="Times New Roman"/>
-          <w:sz w:val="26"/>
-          <w:lang w:val="ru-RU"/>
-        </w:rPr>
-        <w:t xml:space="preserve"> и остальные структуры форматов.</w:t>
+        <w:t>Получать метаданные без сторонних библиотек: открывать файл через FileStream и самостоятельно читать байты по спецификации формата, находя сигнатуры, маркеры, чанки и теги. Сторонние средства использовать только для предпросмотра.</w:t>
       </w:r>
     </w:p>
     <w:p>
@@ -316,7 +162,7 @@
           <w:ilvl w:val="0"/>
           <w:numId w:val="10"/>
         </w:numPr>
-        <w:spacing w:after="40" w:line="278" w:lineRule="auto"/>
+        <w:spacing w:after="0" w:line="278" w:lineRule="auto"/>
         <w:jc w:val="both"/>
         <w:rPr>
           <w:lang w:val="ru-RU"/>
@@ -324,11 +170,10 @@
       </w:pPr>
       <w:r>
         <w:rPr>
-          <w:rFonts w:eastAsia="Times New Roman" w:ascii="Times New Roman" w:hAnsi="Times New Roman"/>
+          <w:rFonts w:ascii="Times New Roman" w:hAnsi="Times New Roman" w:eastAsia="Times New Roman"/>
           <w:sz w:val="26"/>
-          <w:lang w:val="ru-RU"/>
         </w:rPr>
-        <w:t>Организовать потоковое чтение, многопоточную обработку, отзывчивый интерфейс и прогресс-бар.</w:t>
+        <w:t>Реализовать потоковое чтение только необходимых частей файла, многопоточную обработку без блокировки интерфейса, индикацию прогресса и обработку повреждённых файлов.</w:t>
       </w:r>
     </w:p>
     <w:p>
@@ -338,7 +183,7 @@
           <w:ilvl w:val="0"/>
           <w:numId w:val="10"/>
         </w:numPr>
-        <w:spacing w:after="40" w:line="278" w:lineRule="auto"/>
+        <w:spacing w:after="0" w:line="278" w:lineRule="auto"/>
         <w:jc w:val="both"/>
         <w:rPr>
           <w:lang w:val="ru-RU"/>
@@ -346,25 +191,16 @@
       </w:pPr>
       <w:r>
         <w:rPr>
-          <w:rFonts w:eastAsia="Times New Roman" w:ascii="Times New Roman" w:hAnsi="Times New Roman"/>
+          <w:rFonts w:ascii="Times New Roman" w:hAnsi="Times New Roman" w:eastAsia="Times New Roman"/>
           <w:sz w:val="26"/>
-          <w:lang w:val="ru-RU"/>
         </w:rPr>
-        <w:t>Определять</w:t>
-      </w:r>
-      <w:r>
-        <w:rPr>
-          <w:rFonts w:eastAsia="Times New Roman" w:ascii="Times New Roman" w:hAnsi="Times New Roman"/>
-          <w:sz w:val="26"/>
-          <w:lang w:val="ru-RU"/>
-        </w:rPr>
-        <w:t xml:space="preserve"> формат по сигнатуре и корректно обрабатывать повреждённые файлы и подменённые расширения.</w:t>
+        <w:t>Для BMP вручную разобрать BITMAPFILEHEADER и BITMAPINFOHEADER, определить BI_RGB, BI_RLE8, BI_RLE4 и понимать устройство палитры; для PNG найти сигнатуру и IHDR, считать ширину, высоту, глубину цвета и метод фильтрации.</w:t>
       </w:r>
     </w:p>
     <w:p>
       <w:pPr>
         <w:keepNext/>
-        <w:spacing w:before="180" w:after="80" w:line="278" w:lineRule="auto"/>
+        <w:spacing w:before="180" w:after="0" w:line="278" w:lineRule="auto"/>
         <w:jc w:val="both"/>
       </w:pPr>
       <w:r>
@@ -378,7 +214,7 @@
     </w:p>
     <w:p>
       <w:pPr>
-        <w:spacing w:after="80" w:line="278" w:lineRule="auto"/>
+        <w:spacing w:after="0" w:line="278" w:lineRule="auto"/>
         <w:ind w:firstLine="312"/>
         <w:jc w:val="both"/>
         <w:rPr>
@@ -387,188 +223,15 @@
       </w:pPr>
       <w:r>
         <w:rPr>
-          <w:rFonts w:eastAsia="Times New Roman" w:ascii="Times New Roman" w:hAnsi="Times New Roman"/>
+          <w:rFonts w:ascii="Times New Roman" w:hAnsi="Times New Roman" w:eastAsia="Times New Roman"/>
           <w:sz w:val="26"/>
         </w:rPr>
-        <w:t xml:space="preserve">Язык C#, Microsoft Visual Studio, .NET 10.0, Windows Forms. </w:t>
-      </w:r>
-      <w:r>
-        <w:rPr>
-          <w:rFonts w:eastAsia="Times New Roman" w:ascii="Times New Roman" w:hAnsi="Times New Roman"/>
-          <w:sz w:val="26"/>
-          <w:lang w:val="ru-RU"/>
-        </w:rPr>
-        <w:t xml:space="preserve">Для чтения байтов использованы </w:t>
-      </w:r>
-      <w:r>
-        <w:rPr>
-          <w:rFonts w:eastAsia="Times New Roman" w:ascii="Times New Roman" w:hAnsi="Times New Roman"/>
-          <w:sz w:val="26"/>
-        </w:rPr>
-        <w:t>FileStream</w:t>
-      </w:r>
-      <w:r>
-        <w:rPr>
-          <w:rFonts w:eastAsia="Times New Roman" w:ascii="Times New Roman" w:hAnsi="Times New Roman"/>
-          <w:sz w:val="26"/>
-          <w:lang w:val="ru-RU"/>
-        </w:rPr>
-        <w:t xml:space="preserve">, </w:t>
-      </w:r>
-      <w:r>
-        <w:rPr>
-          <w:rFonts w:eastAsia="Times New Roman" w:ascii="Times New Roman" w:hAnsi="Times New Roman"/>
-          <w:sz w:val="26"/>
-        </w:rPr>
-        <w:t>ReadExactly</w:t>
-      </w:r>
-      <w:r>
-        <w:rPr>
-          <w:rFonts w:eastAsia="Times New Roman" w:ascii="Times New Roman" w:hAnsi="Times New Roman"/>
-          <w:sz w:val="26"/>
-          <w:lang w:val="ru-RU"/>
-        </w:rPr>
-        <w:t xml:space="preserve"> и </w:t>
-      </w:r>
-      <w:r>
-        <w:rPr>
-          <w:rFonts w:eastAsia="Times New Roman" w:ascii="Times New Roman" w:hAnsi="Times New Roman"/>
-          <w:sz w:val="26"/>
-        </w:rPr>
-        <w:t>Seek</w:t>
-      </w:r>
-      <w:r>
-        <w:rPr>
-          <w:rFonts w:eastAsia="Times New Roman" w:ascii="Times New Roman" w:hAnsi="Times New Roman"/>
-          <w:sz w:val="26"/>
-          <w:lang w:val="ru-RU"/>
-        </w:rPr>
-        <w:t xml:space="preserve">; для параллельного обхода — </w:t>
-      </w:r>
-      <w:r>
-        <w:rPr>
-          <w:rFonts w:eastAsia="Times New Roman" w:ascii="Times New Roman" w:hAnsi="Times New Roman"/>
-          <w:sz w:val="26"/>
-        </w:rPr>
-        <w:t>Parallel</w:t>
-      </w:r>
-      <w:r>
-        <w:rPr>
-          <w:rFonts w:eastAsia="Times New Roman" w:ascii="Times New Roman" w:hAnsi="Times New Roman"/>
-          <w:sz w:val="26"/>
-          <w:lang w:val="ru-RU"/>
-        </w:rPr>
-        <w:t>.</w:t>
-      </w:r>
-      <w:r>
-        <w:rPr>
-          <w:rFonts w:eastAsia="Times New Roman" w:ascii="Times New Roman" w:hAnsi="Times New Roman"/>
-          <w:sz w:val="26"/>
-        </w:rPr>
-        <w:t>ForEachAsync</w:t>
-      </w:r>
-      <w:r>
-        <w:rPr>
-          <w:rFonts w:eastAsia="Times New Roman" w:ascii="Times New Roman" w:hAnsi="Times New Roman"/>
-          <w:sz w:val="26"/>
-          <w:lang w:val="ru-RU"/>
-        </w:rPr>
-        <w:t xml:space="preserve">. </w:t>
-      </w:r>
-      <w:r>
-        <w:rPr>
-          <w:rFonts w:eastAsia="Times New Roman" w:ascii="Times New Roman" w:hAnsi="Times New Roman"/>
-          <w:sz w:val="26"/>
-        </w:rPr>
-        <w:t>System</w:t>
-      </w:r>
-      <w:r>
-        <w:rPr>
-          <w:rFonts w:eastAsia="Times New Roman" w:ascii="Times New Roman" w:hAnsi="Times New Roman"/>
-          <w:sz w:val="26"/>
-          <w:lang w:val="ru-RU"/>
-        </w:rPr>
-        <w:t>.</w:t>
-      </w:r>
-      <w:r>
-        <w:rPr>
-          <w:rFonts w:eastAsia="Times New Roman" w:ascii="Times New Roman" w:hAnsi="Times New Roman"/>
-          <w:sz w:val="26"/>
-        </w:rPr>
-        <w:t>Drawing</w:t>
-      </w:r>
-      <w:r>
-        <w:rPr>
-          <w:rFonts w:eastAsia="Times New Roman" w:ascii="Times New Roman" w:hAnsi="Times New Roman"/>
-          <w:sz w:val="26"/>
-          <w:lang w:val="ru-RU"/>
-        </w:rPr>
-        <w:t xml:space="preserve"> применяется только для предпросмотра, не для получения метаданных. Для запуска обычной сборки нужен </w:t>
-      </w:r>
-      <w:r>
-        <w:rPr>
-          <w:rFonts w:eastAsia="Times New Roman" w:ascii="Times New Roman" w:hAnsi="Times New Roman"/>
-          <w:sz w:val="26"/>
-        </w:rPr>
-        <w:t>Windows</w:t>
-      </w:r>
-      <w:r>
-        <w:rPr>
-          <w:rFonts w:eastAsia="Times New Roman" w:ascii="Times New Roman" w:hAnsi="Times New Roman"/>
-          <w:sz w:val="26"/>
-          <w:lang w:val="ru-RU"/>
-        </w:rPr>
-        <w:t xml:space="preserve"> и .</w:t>
-      </w:r>
-      <w:r>
-        <w:rPr>
-          <w:rFonts w:eastAsia="Times New Roman" w:ascii="Times New Roman" w:hAnsi="Times New Roman"/>
-          <w:sz w:val="26"/>
-        </w:rPr>
-        <w:t>NET</w:t>
-      </w:r>
-      <w:r>
-        <w:rPr>
-          <w:rFonts w:eastAsia="Times New Roman" w:ascii="Times New Roman" w:hAnsi="Times New Roman"/>
-          <w:sz w:val="26"/>
-          <w:lang w:val="ru-RU"/>
-        </w:rPr>
-        <w:t xml:space="preserve"> 10 </w:t>
-      </w:r>
-      <w:r>
-        <w:rPr>
-          <w:rFonts w:eastAsia="Times New Roman" w:ascii="Times New Roman" w:hAnsi="Times New Roman"/>
-          <w:sz w:val="26"/>
-        </w:rPr>
-        <w:t>Desktop</w:t>
-      </w:r>
-      <w:r>
-        <w:rPr>
-          <w:rFonts w:eastAsia="Times New Roman" w:ascii="Times New Roman" w:hAnsi="Times New Roman"/>
-          <w:sz w:val="26"/>
-          <w:lang w:val="ru-RU"/>
-        </w:rPr>
-        <w:t xml:space="preserve"> </w:t>
-      </w:r>
-      <w:r>
-        <w:rPr>
-          <w:rFonts w:eastAsia="Times New Roman" w:ascii="Times New Roman" w:hAnsi="Times New Roman"/>
-          <w:sz w:val="26"/>
-        </w:rPr>
-        <w:t>Runtime</w:t>
-      </w:r>
-      <w:r>
-        <w:rPr>
-          <w:rFonts w:eastAsia="Times New Roman" w:ascii="Times New Roman" w:hAnsi="Times New Roman"/>
-          <w:sz w:val="26"/>
-          <w:lang w:val="ru-RU"/>
-        </w:rPr>
-        <w:t>.</w:t>
+        <w:t>Язык C#, Microsoft Visual Studio, .NET 10.0, Windows Forms. Для чтения байтов используются FileStream, ReadExactly и Seek; для параллельной обработки — Parallel.ForEachAsync. System.Drawing применяется только для предпросмотра, а не для получения метаданных.</w:t>
       </w:r>
     </w:p>
     <w:p>
       <w:pPr>
-        <w:spacing w:after="100" w:line="278" w:lineRule="auto"/>
+        <w:spacing w:after="0" w:line="278" w:lineRule="auto"/>
         <w:ind w:firstLine="312"/>
         <w:rPr>
           <w:rFonts w:eastAsia="Times New Roman"/>
@@ -594,7 +257,7 @@
     </w:p>
     <w:p>
       <w:pPr>
-        <w:spacing w:after="100" w:line="278" w:lineRule="auto"/>
+        <w:spacing w:after="0" w:line="278" w:lineRule="auto"/>
         <w:ind w:firstLine="312"/>
         <w:rPr>
           <w:lang w:val="ru-RU"/>
@@ -762,7 +425,7 @@
     <w:p>
       <w:pPr>
         <w:keepNext/>
-        <w:spacing w:before="180" w:after="80" w:line="278" w:lineRule="auto"/>
+        <w:spacing w:before="180" w:after="0" w:line="278" w:lineRule="auto"/>
         <w:jc w:val="both"/>
         <w:rPr>
           <w:lang w:val="ru-RU"/>
@@ -780,7 +443,7 @@
     </w:p>
     <w:p>
       <w:pPr>
-        <w:spacing w:after="100" w:line="278" w:lineRule="auto"/>
+        <w:spacing w:after="0" w:line="278" w:lineRule="auto"/>
         <w:jc w:val="both"/>
         <w:rPr>
           <w:lang w:val="ru-RU"/>
@@ -788,93 +451,23 @@
       </w:pPr>
       <w:r>
         <w:rPr>
-          <w:rFonts w:eastAsia="Times New Roman" w:ascii="Times New Roman" w:hAnsi="Times New Roman"/>
+          <w:rFonts w:ascii="Times New Roman" w:hAnsi="Times New Roman" w:eastAsia="Times New Roman"/>
           <w:b/>
           <w:sz w:val="26"/>
-          <w:lang w:val="ru-RU"/>
         </w:rPr>
         <w:t>1. Создание интерфейса.</w:t>
       </w:r>
       <w:r>
         <w:rPr>
-          <w:rFonts w:eastAsia="Times New Roman" w:ascii="Times New Roman" w:hAnsi="Times New Roman"/>
-          <w:sz w:val="26"/>
-          <w:lang w:val="ru-RU"/>
-        </w:rPr>
-        <w:t xml:space="preserve"> В </w:t>
-      </w:r>
-      <w:r>
-        <w:rPr>
-          <w:rFonts w:eastAsia="Times New Roman" w:ascii="Times New Roman" w:hAnsi="Times New Roman"/>
+          <w:rFonts w:ascii="Times New Roman" w:hAnsi="Times New Roman" w:eastAsia="Times New Roman"/>
           <w:sz w:val="26"/>
         </w:rPr>
-        <w:t>Windows</w:t>
-      </w:r>
-      <w:r>
-        <w:rPr>
-          <w:rFonts w:eastAsia="Times New Roman" w:ascii="Times New Roman" w:hAnsi="Times New Roman"/>
-          <w:sz w:val="26"/>
-          <w:lang w:val="ru-RU"/>
-        </w:rPr>
-        <w:t xml:space="preserve"> </w:t>
-      </w:r>
-      <w:r>
-        <w:rPr>
-          <w:rFonts w:eastAsia="Times New Roman" w:ascii="Times New Roman" w:hAnsi="Times New Roman"/>
-          <w:sz w:val="26"/>
-        </w:rPr>
-        <w:t>Forms</w:t>
-      </w:r>
-      <w:r>
-        <w:rPr>
-          <w:rFonts w:eastAsia="Times New Roman" w:ascii="Times New Roman" w:hAnsi="Times New Roman"/>
-          <w:sz w:val="26"/>
-          <w:lang w:val="ru-RU"/>
-        </w:rPr>
-        <w:t xml:space="preserve"> добавлены </w:t>
-      </w:r>
-      <w:r>
-        <w:rPr>
-          <w:rFonts w:eastAsia="Times New Roman" w:ascii="Times New Roman" w:hAnsi="Times New Roman"/>
-          <w:sz w:val="26"/>
-          <w:lang w:val="ru-RU"/>
-        </w:rPr>
-        <w:t xml:space="preserve">выбор папки, кнопки «Сканировать» и «Остановить», </w:t>
-      </w:r>
-      <w:r>
-        <w:rPr>
-          <w:rFonts w:eastAsia="Times New Roman" w:ascii="Times New Roman" w:hAnsi="Times New Roman"/>
-          <w:sz w:val="26"/>
-        </w:rPr>
-        <w:t>DataGridView</w:t>
-      </w:r>
-      <w:r>
-        <w:rPr>
-          <w:rFonts w:eastAsia="Times New Roman" w:ascii="Times New Roman" w:hAnsi="Times New Roman"/>
-          <w:sz w:val="26"/>
-          <w:lang w:val="ru-RU"/>
-        </w:rPr>
-        <w:t xml:space="preserve">, </w:t>
-      </w:r>
-      <w:r>
-        <w:rPr>
-          <w:rFonts w:eastAsia="Times New Roman" w:ascii="Times New Roman" w:hAnsi="Times New Roman"/>
-          <w:sz w:val="26"/>
-        </w:rPr>
-        <w:t>ProgressBar</w:t>
-      </w:r>
-      <w:r>
-        <w:rPr>
-          <w:rFonts w:eastAsia="Times New Roman" w:ascii="Times New Roman" w:hAnsi="Times New Roman"/>
-          <w:sz w:val="26"/>
-          <w:lang w:val="ru-RU"/>
-        </w:rPr>
-        <w:t>, предпросмотр и информация о выделенном файле.</w:t>
+        <w:t xml:space="preserve"> Реализованы выбор папки, запуск и остановка сканирования, таблица характеристик, ProgressBar, предпросмотр и счётчики обработанных, повреждённых и неизвестных файлов.</w:t>
       </w:r>
     </w:p>
     <w:p>
       <w:pPr>
-        <w:spacing w:after="100" w:line="278" w:lineRule="auto"/>
+        <w:spacing w:after="0" w:line="278" w:lineRule="auto"/>
         <w:jc w:val="both"/>
         <w:rPr>
           <w:lang w:val="ru-RU"/>
@@ -893,12 +486,12 @@
           <w:rFonts w:ascii="Times New Roman" w:hAnsi="Times New Roman" w:eastAsia="Times New Roman"/>
           <w:sz w:val="26"/>
         </w:rPr>
-        <w:t xml:space="preserve"> Form1 отвечает за интерфейс, ImageInfo хранит результат, ImageScanner определяет формат по сигнатуре и вызывает один из шести парсеров.</w:t>
+        <w:t xml:space="preserve"> Form1 отвечает за интерфейс; ImageInfo хранит результат; ImageScanner определяет фактический формат по сигнатуре и вызывает соответствующий парсер; отдельные классы Parsers разбирают BMP, PNG, JPEG, GIF, TIFF и PCX.</w:t>
       </w:r>
     </w:p>
     <w:p>
       <w:pPr>
-        <w:spacing w:after="100" w:line="278" w:lineRule="auto"/>
+        <w:spacing w:after="0" w:line="278" w:lineRule="auto"/>
         <w:jc w:val="both"/>
         <w:rPr>
           <w:lang w:val="ru-RU"/>
@@ -917,12 +510,12 @@
           <w:rFonts w:ascii="Times New Roman" w:hAnsi="Times New Roman" w:eastAsia="Times New Roman"/>
           <w:sz w:val="26"/>
         </w:rPr>
-        <w:t xml:space="preserve"> BMP разбирается по BITMAPFILEHEADER/BITMAPINFOHEADER, PNG — по IHDR, pHYs, IEND, JPEG — по SOI, APP0, SOF, EOI, GIF — по заголовку и палитре, PCX — по 128-байтовому заголовку, TIFF — по IFD-тегам.</w:t>
+        <w:t xml:space="preserve"> BMP разбирается по BITMAPFILEHEADER и BITMAPINFOHEADER; PNG — по чанкам IHDR, pHYs и IEND; JPEG — по маркерам SOI, APP0/JFIF, SOF и EOI; GIF — по заголовку и таблице цветов; PCX — по 128-байтовому заголовку; TIFF — по IFD-тегам. Из файла считываются только необходимые поля.</w:t>
       </w:r>
     </w:p>
     <w:p>
       <w:pPr>
-        <w:spacing w:after="100" w:line="278" w:lineRule="auto"/>
+        <w:spacing w:after="0" w:line="278" w:lineRule="auto"/>
         <w:jc w:val="both"/>
         <w:rPr>
           <w:lang w:val="ru-RU"/>
@@ -934,19 +527,19 @@
           <w:b/>
           <w:sz w:val="26"/>
         </w:rPr>
-        <w:t>4. Обработка папки.</w:t>
+        <w:t>4. Обход и многопоточность.</w:t>
       </w:r>
       <w:r>
         <w:rPr>
           <w:rFonts w:ascii="Times New Roman" w:hAnsi="Times New Roman" w:eastAsia="Times New Roman"/>
           <w:sz w:val="26"/>
         </w:rPr>
-        <w:t xml:space="preserve"> Directory.GetFiles с SearchOption.AllDirectories получает файлы из папки и подкаталогов. Parallel.ForEachAsync обрабатывает их параллельно; Environment.ProcessorCount ограничивает число задач, Interlocked защищает счётчик, Invoke обновляет интерфейс, CancellationToken останавливает работу.</w:t>
+        <w:t xml:space="preserve"> Через Directory.GetFiles с SearchOption.AllDirectories формируется список файлов выбранной папки и всех подкаталогов. Parallel.ForEachAsync распределяет их между параллельными задачами; MaxDegreeOfParallelism ограничивается Environment.ProcessorCount. Interlocked.Increment безопасно меняет общий счётчик, Invoke обновляет WinForms-интерфейс из UI-потока, CancellationToken обеспечивает кнопку «Остановить».</w:t>
       </w:r>
     </w:p>
     <w:p>
       <w:pPr>
-        <w:spacing w:after="100" w:line="278" w:lineRule="auto"/>
+        <w:spacing w:after="0" w:line="278" w:lineRule="auto"/>
         <w:jc w:val="both"/>
         <w:rPr>
           <w:lang w:val="ru-RU"/>
@@ -965,13 +558,13 @@
           <w:rFonts w:ascii="Times New Roman" w:hAnsi="Times New Roman" w:eastAsia="Times New Roman"/>
           <w:sz w:val="26"/>
         </w:rPr>
-        <w:t xml:space="preserve"> ImageScanner сверяет расширение с сигнатурой; парсеры проверяют длины и завершающие маркеры и возвращают статус ошибки без остановки всей программы.</w:t>
+        <w:t xml:space="preserve"> ImageScanner сверяет расширение с реальной сигнатурой. Парсеры контролируют длины структур и завершающие маркеры; отсутствие IEND у PNG или EOI у JPEG, неверные размеры и неизвестный формат приводят к отдельному статусу, а не к аварийному завершению.</w:t>
       </w:r>
     </w:p>
     <w:p>
       <w:pPr>
         <w:keepNext/>
-        <w:spacing w:before="180" w:after="80" w:line="278" w:lineRule="auto"/>
+        <w:spacing w:before="180" w:after="0" w:line="278" w:lineRule="auto"/>
         <w:jc w:val="both"/>
         <w:rPr>
           <w:lang w:val="ru-RU"/>
@@ -998,7 +591,7 @@
     </w:p>
     <w:p>
       <w:pPr>
-        <w:spacing w:after="80" w:line="278" w:lineRule="auto"/>
+        <w:spacing w:after="0" w:line="278" w:lineRule="auto"/>
         <w:ind w:firstLine="312"/>
         <w:jc w:val="both"/>
         <w:rPr>
@@ -1010,12 +603,12 @@
           <w:rFonts w:ascii="Times New Roman" w:hAnsi="Times New Roman" w:eastAsia="Times New Roman"/>
           <w:sz w:val="26"/>
         </w:rPr>
-        <w:t>Проверены BMP, PNG, JPEG, GIF, TIFF и PCX. Выводятся размеры, глубина цвета, сжатие и DPI при наличии физической плотности. Для BMP определяются BI_RGB, BI_RLE8, BI_RLE4; для TIFF тип сжатия берётся из тега Compression.</w:t>
+        <w:t>Проверены все шесть требуемых форматов. Программа выводит размеры, глубину цвета, тип сжатия и DPI, если физическая плотность действительно записана в файле. DPI нельзя вычислить только по числу пикселей: DPI = количество пикселей / физический размер в дюймах. Поэтому при отсутствии физического размера или плотности выводится «Не задано». В BMP и PNG плотность может храниться в пикселях на метр и переводится в DPI умножением на 0,0254; JPEG/JFIF может хранить плотность в точках на дюйм или сантиметр; TIFF использует XResolution, YResolution и ResolutionUnit; PCX содержит HDpi и VDpi.</w:t>
       </w:r>
     </w:p>
     <w:p>
       <w:pPr>
-        <w:spacing w:after="80" w:line="278" w:lineRule="auto"/>
+        <w:spacing w:after="0" w:line="278" w:lineRule="auto"/>
         <w:ind w:firstLine="312"/>
         <w:jc w:val="both"/>
         <w:rPr>
@@ -1027,12 +620,12 @@
           <w:rFonts w:ascii="Times New Roman" w:hAnsi="Times New Roman" w:eastAsia="Times New Roman"/>
           <w:sz w:val="26"/>
         </w:rPr>
-        <w:t>После введения многопоточности время на небольшом наборе уменьшилось с 0,38 до 0,17 с. Набор из 2000 JPEG обработан примерно за 0,86 с. Интерфейс остаётся отзывчивым.</w:t>
+        <w:t>После введения параллельной обработки время на небольшом наборе уменьшилось примерно с 0,38 до 0,17 с; 2000 JPEG были обработаны примерно за 0,86 с. Это возможно, потому что файлы независимы друг от друга. Количество одновременно выполняемых операций ограничивается числом логических процессоров, а интерфейс остаётся отзывчивым за счёт отдельного обновления через Invoke.</w:t>
       </w:r>
     </w:p>
     <w:p>
       <w:pPr>
-        <w:spacing w:after="80" w:line="278" w:lineRule="auto"/>
+        <w:spacing w:after="0" w:line="278" w:lineRule="auto"/>
         <w:ind w:firstLine="312"/>
         <w:jc w:val="both"/>
         <w:rPr>
@@ -1044,13 +637,13 @@
           <w:rFonts w:ascii="Times New Roman" w:hAnsi="Times New Roman" w:eastAsia="Times New Roman"/>
           <w:sz w:val="26"/>
         </w:rPr>
-        <w:t>На повреждённых копиях проверены отсутствие EOI у JPEG, IEND у PNG, неверный размер BMP и подмена расширения. Ошибочный файл получает статус, обработка остальных продолжается.</w:t>
+        <w:t>На повреждённых копиях проверены отсутствие EOI у JPEG, IEND у PNG, неверные длины и размеры BMP, а также подмена расширения. Повреждённые и неизвестные файлы учитываются отдельно, после чего обработка остальных файлов продолжается.</w:t>
       </w:r>
     </w:p>
     <w:p>
       <w:pPr>
         <w:keepNext/>
-        <w:spacing w:before="180" w:after="80" w:line="278" w:lineRule="auto"/>
+        <w:spacing w:before="180" w:after="0" w:line="278" w:lineRule="auto"/>
         <w:jc w:val="both"/>
         <w:rPr>
           <w:lang w:val="ru-RU"/>
@@ -1068,7 +661,7 @@
     </w:p>
     <w:p>
       <w:pPr>
-        <w:spacing w:after="80" w:line="278" w:lineRule="auto"/>
+        <w:spacing w:after="0" w:line="278" w:lineRule="auto"/>
         <w:ind w:firstLine="312"/>
         <w:jc w:val="both"/>
         <w:rPr>
@@ -1080,13 +673,16 @@
           <w:rFonts w:ascii="Times New Roman" w:hAnsi="Times New Roman" w:eastAsia="Times New Roman"/>
           <w:sz w:val="26"/>
         </w:rPr>
-        <w:t>В ходе работы изучены основные способы сжатия. BMP может использовать BI_RGB без RLE-сжатия либо BI_RLE8/BI_RLE4. RLE заменяет повторяющуюся серию парой «количество + значение»: AAAAA BBB → 5A 3B, поэтому данные восстанавливаются без потерь. PNG использует Deflate, GIF — LZW, PCX — RLE; это также алгоритмы без потерь. TIFF может применять LZW, Deflate, PackBits или JPEG. JPEG сжимает с потерями: при квантовании часть коэффициентов округляется, поэтому файл становится меньше, но исходные пиксели точно не восстанавливаются. Для фотографий это обычно допустимо, а для текста и схем предпочтительно сжатие без потерь.</w:t>
+        <w:t>В ходе работы были изучены различия в хранении растровых данных и метаданных. В BMP поле biCompression позволяет различать BI_RGB, BI_RLE8 и BI_RLE4. RLE (Run-Length Encoding) заменяет серии одинаковых значений парой «длина серии + значение» и относится к сжатию без потерь. PNG применяет Deflate — также без потерь, поэтому после распаковки восстанавливаются исходные значения пикселей. Такой подход особенно важен для схем, текста, интерфейсной графики и прозрачности. GIF использует LZW без потерь, но обычно ограничен палитрой до 256 цветов: ухудшение может появиться при переводе полноцветной картинки в палитру, а не из-за LZW. PCX использует RLE. TIFF может хранить изображение без сжатия или применять PackBits, LZW, Deflate и JPEG в зависимости от тега Compression.</w:t>
         <w:br/>
         <w:br/>
-        <w:t>DPI считывается только из реально записанной физической плотности. Если она отсутствует, по одним размерам в пикселях DPI определить нельзя — нужен физический размер изображения.</w:t>
+        <w:t>JPEG ориентирован прежде всего на фотографии и обычно использует сжатие с потерями. При кодировании изображение переводится в частотное представление, после чего выполняется квантование: часть мелких высокочастотных деталей хранится менее точно. Это уменьшает объём файла, но точное исходное изображение уже не восстанавливается. Для фотографий такая потеря обычно менее заметна, тогда как для текста, схем и изображений с резкими границами чаще предпочтительно сжатие без потерь.</w:t>
         <w:br/>
         <w:br/>
-        <w:t>Многопоточность реализована через Parallel.ForEachAsync: независимые файлы обрабатываются несколькими задачами, число которых ограничено Environment.ProcessorCount. Interlocked безопасно увеличивает общий счётчик, Invoke обновляет интерфейс из UI-потока, CancellationToken останавливает сканирование. Это ускоряет обработку и не блокирует форму.</w:t>
+        <w:t>Разрешение DPI определяется только по реально записанным данным. Если физическая плотность отсутствует, ширина и высота в пикселях сами по себе не дают DPI: например, 1920 пикселей могут соответствовать 96 DPI при ширине 20 дюймов или 192 DPI при ширине 10 дюймов. Поэтому программа не подставляет вымышленное значение и выводит «Не задано».</w:t>
+        <w:br/>
+        <w:br/>
+        <w:t>Для обработки больших наборов файлов используется обход выбранной директории и её подкаталогов, после чего файлы передаются в Parallel.ForEachAsync. Ограничение MaxDegreeOfParallelism не позволяет запускать слишком много операций одновременно; Interlocked исключает гонку данных при изменении общего счётчика; Invoke безопасно обновляет интерфейс; CancellationToken позволяет остановить сканирование. В сочетании с FileStream и Seek это позволяет читать только необходимые участки файлов, не загружать изображения целиком и сохранять отзывчивость приложения. Реализованы ручной парсинг шести форматов, определение сжатия, проверка повреждений и подменённых расширений, а также подсчёт повреждённых и неизвестных файлов.</w:t>
       </w:r>
     </w:p>
     <w:sectPr>

</xml_diff>

<commit_message>
redone 2 lab 2
</commit_message>
<xml_diff>
--- a/lab2/lab2_отчет.docx
+++ b/lab2/lab2_отчет.docx
@@ -451,7 +451,7 @@
       </w:pPr>
       <w:r>
         <w:rPr>
-          <w:rFonts w:ascii="Times New Roman" w:hAnsi="Times New Roman" w:eastAsia="Times New Roman"/>
+          <w:rFonts w:ascii="Times New Roman" w:hAnsi="Times New Roman"/>
           <w:b/>
           <w:sz w:val="26"/>
         </w:rPr>
@@ -459,10 +459,10 @@
       </w:r>
       <w:r>
         <w:rPr>
-          <w:rFonts w:ascii="Times New Roman" w:hAnsi="Times New Roman" w:eastAsia="Times New Roman"/>
+          <w:rFonts w:ascii="Times New Roman" w:hAnsi="Times New Roman"/>
           <w:sz w:val="26"/>
         </w:rPr>
-        <w:t xml:space="preserve"> Реализованы выбор папки, запуск и остановка сканирования, таблица характеристик, ProgressBar, предпросмотр и счётчики обработанных, повреждённых и неизвестных файлов.</w:t>
+        <w:t xml:space="preserve"> Реализованы выбор папки, запуск и остановка сканирования, таблица характеристик, ProgressBar, предпросмотр, счётчики обработанных, повреждённых и неизвестных файлов и кнопка «Доп. информация». Подробные данные открываются в отдельном окне, чтобы не перегружать основную таблицу.</w:t>
       </w:r>
     </w:p>
     <w:p>
@@ -499,7 +499,7 @@
       </w:pPr>
       <w:r>
         <w:rPr>
-          <w:rFonts w:ascii="Times New Roman" w:hAnsi="Times New Roman" w:eastAsia="Times New Roman"/>
+          <w:rFonts w:ascii="Times New Roman" w:hAnsi="Times New Roman"/>
           <w:b/>
           <w:sz w:val="26"/>
         </w:rPr>
@@ -507,10 +507,10 @@
       </w:r>
       <w:r>
         <w:rPr>
-          <w:rFonts w:ascii="Times New Roman" w:hAnsi="Times New Roman" w:eastAsia="Times New Roman"/>
+          <w:rFonts w:ascii="Times New Roman" w:hAnsi="Times New Roman"/>
           <w:sz w:val="26"/>
         </w:rPr>
-        <w:t xml:space="preserve"> BMP разбирается по BITMAPFILEHEADER и BITMAPINFOHEADER; PNG — по чанкам IHDR, pHYs и IEND; JPEG — по маркерам SOI, APP0/JFIF, SOF и EOI; GIF — по заголовку и таблице цветов; PCX — по 128-байтовому заголовку; TIFF — по IFD-тегам. Из файла считываются только необходимые поля.</w:t>
+        <w:t xml:space="preserve"> BMP разбирается по BITMAPFILEHEADER и BITMAPINFOHEADER; PNG — по чанкам IHDR, pHYs и IEND; JPEG — по маркерам SOI, APP0/JFIF, DQT, SOF и EOI; GIF — по заголовку и глобальной таблице цветов; PCX — по 128-байтовому заголовку; TIFF — по IFD-тегам. Для JPEG дополнительно извлекаются матрицы квантования DQT, для GIF — число цветов палитры, для PNG — метод фильтрации.</w:t>
       </w:r>
     </w:p>
     <w:p>
@@ -600,10 +600,10 @@
       </w:pPr>
       <w:r>
         <w:rPr>
-          <w:rFonts w:ascii="Times New Roman" w:hAnsi="Times New Roman" w:eastAsia="Times New Roman"/>
+          <w:rFonts w:ascii="Times New Roman" w:hAnsi="Times New Roman"/>
           <w:sz w:val="26"/>
         </w:rPr>
-        <w:t>Проверены все шесть требуемых форматов. Программа выводит размеры, глубину цвета, тип сжатия и DPI, если физическая плотность действительно записана в файле. DPI нельзя вычислить только по числу пикселей: DPI = количество пикселей / физический размер в дюймах. Поэтому при отсутствии физического размера или плотности выводится «Не задано». В BMP и PNG плотность может храниться в пикселях на метр и переводится в DPI умножением на 0,0254; JPEG/JFIF может хранить плотность в точках на дюйм или сантиметр; TIFF использует XResolution, YResolution и ResolutionUnit; PCX содержит HDpi и VDpi.</w:t>
+        <w:t>Проверены все шесть требуемых форматов. Программа выводит имя, размеры, глубину цвета, тип сжатия, DPI и статус файла. Если физическая плотность записана в формате, она считывается вручную: BMP и PNG хранят плотность в пикселях на метр и переводятся по формуле DPI = pixelsPerMeter · 0,0254; JPEG/JFIF хранит плотность в точках на дюйм или сантиметр; TIFF использует XResolution, YResolution и ResolutionUnit; PCX содержит HDpi и VDpi. GIF собственного поля DPI не имеет. Если плотность отсутствует, программа показывает 96 × 96 DPI с пометкой «по умолчанию»; это не вычисленное свойство файла, а принятое экранное значение.</w:t>
       </w:r>
     </w:p>
     <w:p>
@@ -617,10 +617,10 @@
       </w:pPr>
       <w:r>
         <w:rPr>
-          <w:rFonts w:ascii="Times New Roman" w:hAnsi="Times New Roman" w:eastAsia="Times New Roman"/>
+          <w:rFonts w:ascii="Times New Roman" w:hAnsi="Times New Roman"/>
           <w:sz w:val="26"/>
         </w:rPr>
-        <w:t>После введения параллельной обработки время на небольшом наборе уменьшилось примерно с 0,38 до 0,17 с; 2000 JPEG были обработаны примерно за 0,86 с. Это возможно, потому что файлы независимы друг от друга. Количество одновременно выполняемых операций ограничивается числом логических процессоров, а интерфейс остаётся отзывчивым за счёт отдельного обновления через Invoke.</w:t>
+        <w:t>Дополнительная информация вынесена в отдельное окно. Для JPEG из маркера DQT (FF DB) выводятся обе таблицы квантования 8 × 8: таблица яркости и таблица цветности. По таблице яркости рассчитывается приблизительная оценка JPEG quality и условные потери 100% − quality; это оценка интенсивности квантования, а не точный процент визуально потерянной информации. Для GIF выводится число цветов глобальной палитры, а для PNG — метод фильтрации.</w:t>
       </w:r>
     </w:p>
     <w:p>
@@ -634,10 +634,10 @@
       </w:pPr>
       <w:r>
         <w:rPr>
-          <w:rFonts w:ascii="Times New Roman" w:hAnsi="Times New Roman" w:eastAsia="Times New Roman"/>
+          <w:rFonts w:ascii="Times New Roman" w:hAnsi="Times New Roman"/>
           <w:sz w:val="26"/>
         </w:rPr>
-        <w:t>На повреждённых копиях проверены отсутствие EOI у JPEG, IEND у PNG, неверные длины и размеры BMP, а также подмена расширения. Повреждённые и неизвестные файлы учитываются отдельно, после чего обработка остальных файлов продолжается.</w:t>
+        <w:t>После введения параллельной обработки время на небольшом наборе уменьшилось примерно с 0,38 до 0,17 с; 2000 JPEG были обработаны примерно за 0,86 с. На повреждённых копиях проверены отсутствие EOI у JPEG, IEND у PNG, неверные размеры и длины структур, а также подмена расширения. Ошибочные файлы получают отдельный статус, после чего обработка остальных продолжается.</w:t>
       </w:r>
     </w:p>
     <w:p>
@@ -670,19 +670,124 @@
       </w:pPr>
       <w:r>
         <w:rPr>
-          <w:rFonts w:ascii="Times New Roman" w:hAnsi="Times New Roman" w:eastAsia="Times New Roman"/>
+          <w:rFonts w:ascii="Times New Roman" w:hAnsi="Times New Roman"/>
           <w:sz w:val="26"/>
         </w:rPr>
-        <w:t>В ходе работы были изучены различия в хранении растровых данных и метаданных. В BMP поле biCompression позволяет различать BI_RGB, BI_RLE8 и BI_RLE4. RLE (Run-Length Encoding) заменяет серии одинаковых значений парой «длина серии + значение» и относится к сжатию без потерь. PNG применяет Deflate — также без потерь, поэтому после распаковки восстанавливаются исходные значения пикселей. Такой подход особенно важен для схем, текста, интерфейсной графики и прозрачности. GIF использует LZW без потерь, но обычно ограничен палитрой до 256 цветов: ухудшение может появиться при переводе полноцветной картинки в палитру, а не из-за LZW. PCX использует RLE. TIFF может хранить изображение без сжатия или применять PackBits, LZW, Deflate и JPEG в зависимости от тега Compression.</w:t>
-        <w:br/>
-        <w:br/>
-        <w:t>JPEG ориентирован прежде всего на фотографии и обычно использует сжатие с потерями. При кодировании изображение переводится в частотное представление, после чего выполняется квантование: часть мелких высокочастотных деталей хранится менее точно. Это уменьшает объём файла, но точное исходное изображение уже не восстанавливается. Для фотографий такая потеря обычно менее заметна, тогда как для текста, схем и изображений с резкими границами чаще предпочтительно сжатие без потерь.</w:t>
-        <w:br/>
-        <w:br/>
-        <w:t>Разрешение DPI определяется только по реально записанным данным. Если физическая плотность отсутствует, ширина и высота в пикселях сами по себе не дают DPI: например, 1920 пикселей могут соответствовать 96 DPI при ширине 20 дюймов или 192 DPI при ширине 10 дюймов. Поэтому программа не подставляет вымышленное значение и выводит «Не задано».</w:t>
-        <w:br/>
-        <w:br/>
-        <w:t>Для обработки больших наборов файлов используется обход выбранной директории и её подкаталогов, после чего файлы передаются в Parallel.ForEachAsync. Ограничение MaxDegreeOfParallelism не позволяет запускать слишком много операций одновременно; Interlocked исключает гонку данных при изменении общего счётчика; Invoke безопасно обновляет интерфейс; CancellationToken позволяет остановить сканирование. В сочетании с FileStream и Seek это позволяет читать только необходимые участки файлов, не загружать изображения целиком и сохранять отзывчивость приложения. Реализованы ручной парсинг шести форматов, определение сжатия, проверка повреждений и подменённых расширений, а также подсчёт повреждённых и неизвестных файлов.</w:t>
+        <w:t>В результате разработано приложение, которое вручную считывает метаданные JPG, GIF, TIF, BMP, PNG и PCX без библиотек получения метаданных. Формат определяется по сигнатуре, после чего соответствующий парсер через FileStream читает только необходимые заголовки, маркеры, чанки или теги. Реализованы рекурсивный обход подкаталогов, параллельная обработка, прогресс, остановка, предпросмотр и обработка повреждённых и переименованных файлов.</w:t>
+      </w:r>
+    </w:p>
+    <w:p>
+      <w:pPr>
+        <w:spacing w:after="0" w:line="278" w:lineRule="auto"/>
+        <w:ind w:firstLine="312"/>
+        <w:jc w:val="both"/>
+        <w:rPr>
+          <w:lang w:val="ru-RU"/>
+        </w:rPr>
+      </w:pPr>
+      <w:r>
+        <w:rPr>
+          <w:rFonts w:ascii="Times New Roman" w:hAnsi="Times New Roman"/>
+          <w:b w:val="0"/>
+          <w:i w:val="0"/>
+          <w:sz w:val="26"/>
+        </w:rPr>
+        <w:t>Основные форматы хранят характеристики по-разному. В BMP размеры, глубина и тип сжатия находятся в BITMAPINFOHEADER; для индексированных BMP пиксель содержит индекс элемента палитры, а сама палитра хранит соответствующие RGB-цвета. PNG организован как последовательность чанков: IHDR содержит основные параметры, pHYs — физическую плотность, IEND завершает файл. GIF использует таблицу цветов: при n битах индекс палитры позволяет адресовать до 2^n цветов. TIFF хранит параметры в IFD-тегах и требует учёта порядка байтов II/MM. PCX использует фиксированный 128-байтовый заголовок.</w:t>
+      </w:r>
+    </w:p>
+    <w:p>
+      <w:pPr>
+        <w:spacing w:after="0" w:line="278" w:lineRule="auto"/>
+        <w:ind w:firstLine="312"/>
+        <w:jc w:val="both"/>
+        <w:rPr>
+          <w:lang w:val="ru-RU"/>
+        </w:rPr>
+      </w:pPr>
+      <w:r>
+        <w:rPr>
+          <w:rFonts w:ascii="Times New Roman" w:hAnsi="Times New Roman"/>
+          <w:b w:val="0"/>
+          <w:i w:val="0"/>
+          <w:sz w:val="26"/>
+        </w:rPr>
+        <w:t>По типам сжатия алгоритмы различаются. RLE, применяемый в PCX и некоторых BMP, заменяет последовательность одинаковых значений парой «длина серии + значение» и работает без потерь. GIF использует LZW без потерь: повторяющиеся последовательности заменяются кодами словаря; возможное ухудшение GIF связано не с LZW, а с ограничением палитры. PNG применяет Deflate без потерь, сочетающий поиск повторов и энтропийное кодирование. TIFF в зависимости от тега Compression может быть без сжатия либо использовать PackBits, LZW, Deflate или JPEG.</w:t>
+      </w:r>
+    </w:p>
+    <w:p>
+      <w:pPr>
+        <w:spacing w:after="0" w:line="278" w:lineRule="auto"/>
+        <w:ind w:firstLine="312"/>
+        <w:jc w:val="both"/>
+        <w:rPr>
+          <w:lang w:val="ru-RU"/>
+        </w:rPr>
+      </w:pPr>
+      <w:r>
+        <w:rPr>
+          <w:rFonts w:ascii="Times New Roman" w:hAnsi="Times New Roman"/>
+          <w:b w:val="0"/>
+          <w:i w:val="0"/>
+          <w:sz w:val="26"/>
+        </w:rPr>
+        <w:t>JPEG обычно использует сжатие с потерями. Изображение разбивается на блоки, данные переводятся в частотное представление, после чего коэффициенты делятся на элементы матрицы квантования и округляются. Именно квантование является главным источником необратимых потерь: чем больше элементы DQT, тем сильнее округление и тем меньше деталей сохраняется. В программе DQT извлекается из маркера FF DB; значения, записанные в zig-zag порядке, переставляются в обычную матрицу 8 × 8. Обычно используются две таблицы: DQT 0 для яркости и DQT 1 для цветности, так как человеческое зрение чувствительнее к изменениям яркости, чем к мелким цветовым различиям.</w:t>
+      </w:r>
+    </w:p>
+    <w:p>
+      <w:pPr>
+        <w:spacing w:after="0" w:line="278" w:lineRule="auto"/>
+        <w:ind w:firstLine="312"/>
+        <w:jc w:val="both"/>
+        <w:rPr>
+          <w:lang w:val="ru-RU"/>
+        </w:rPr>
+      </w:pPr>
+      <w:r>
+        <w:rPr>
+          <w:rFonts w:ascii="Times New Roman" w:hAnsi="Times New Roman"/>
+          <w:b w:val="0"/>
+          <w:i w:val="0"/>
+          <w:sz w:val="26"/>
+        </w:rPr>
+        <w:t>DPI характеризует физическую плотность точек, поэтому его нельзя достоверно определить только по ширине и высоте изображения в пикселях. Если формат содержит физическую плотность, программа переводит её в dot/inch: для значений «пикселей на метр» используется множитель 0,0254, для «точек на сантиметр» — 2,54. Когда таких данных нет, выводится 96 × 96 DPI с явной пометкой «по умолчанию», поэтому пользователь отличает значение из файла от условного экранного значения.</w:t>
+      </w:r>
+    </w:p>
+    <w:p>
+      <w:pPr>
+        <w:spacing w:after="0" w:line="278" w:lineRule="auto"/>
+        <w:ind w:firstLine="312"/>
+        <w:jc w:val="both"/>
+        <w:rPr>
+          <w:lang w:val="ru-RU"/>
+        </w:rPr>
+      </w:pPr>
+      <w:r>
+        <w:rPr>
+          <w:rFonts w:ascii="Times New Roman" w:hAnsi="Times New Roman"/>
+          <w:b w:val="0"/>
+          <w:i w:val="0"/>
+          <w:sz w:val="26"/>
+        </w:rPr>
+        <w:t>Производительность обеспечивается тем, что файл не загружается целиком: FileStream читает только нужные участки, а Seek позволяет переходить к требуемым структурам. Список файлов выбранной папки и подкаталогов формируется через Directory.GetFiles с SearchOption.AllDirectories, затем Parallel.ForEachAsync распределяет независимые файлы между задачами. MaxDegreeOfParallelism ограничивает число одновременно выполняемых операций числом логических процессоров, Interlocked.Increment защищает общий счётчик от гонок, Invoke безопасно обновляет WinForms-интерфейс, CancellationToken останавливает сканирование.</w:t>
+      </w:r>
+    </w:p>
+    <w:p>
+      <w:pPr>
+        <w:spacing w:after="0" w:line="278" w:lineRule="auto"/>
+        <w:ind w:firstLine="312"/>
+        <w:jc w:val="both"/>
+        <w:rPr>
+          <w:lang w:val="ru-RU"/>
+        </w:rPr>
+      </w:pPr>
+      <w:r>
+        <w:rPr>
+          <w:rFonts w:ascii="Times New Roman" w:hAnsi="Times New Roman"/>
+          <w:b w:val="0"/>
+          <w:i w:val="0"/>
+          <w:sz w:val="26"/>
+        </w:rPr>
+        <w:t>Проверка показала корректную работу на всех шести форматах и на тестах с повреждёнными файлами и подменёнными расширениями. Параллельная обработка уменьшила время небольшого теста примерно с 0,38 до 0,17 с, а набор из 2000 JPEG был обработан примерно за 0,86 с. Дополнительно реализован вывод DQT и оценки степени квантования JPEG, числа цветов палитры GIF и метода фильтрации PNG. Таким образом, программа выполняет обязательные требования лабораторной работы и предоставляет дополнительные данные, полученные непосредственно из структуры файлов.</w:t>
       </w:r>
     </w:p>
     <w:sectPr>

</xml_diff>